<commit_message>
docs: actualiza informe de hitos (integraciones RRSS/GA4 listas para activar)
Actualiza el informe de estado por hitos a 14/08/2026:
- H3: aclara que los conectores de Social Listening (FB/IG/X) y GA4 están
  construidos y verificados, con procedimientos de activación/verificación/
  renovación preparados; acceso a Facebook/Instagram ya facilitado.
- Añade la activación con datos reales de fuentes externas como paso
  pendiente (credenciales) en H3, en la tabla de colaboración y en los
  próximos pasos.
- Regenera el docx InformeEstadoHitosAyuntamientoNijar.docx.

Co-Authored-By: Claude Opus 4.8 <noreply@anthropic.com>
Claude-Session: https://claude.ai/code/session_01FCMjLvkEuppXpAXUZM2gez
</commit_message>
<xml_diff>
--- a/InformeEstadoHitosAyuntamientoNijar.docx
+++ b/InformeEstadoHitosAyuntamientoNijar.docx
@@ -447,7 +447,7 @@
                 <w:sz w:val="20"/>
                 <w:szCs w:val="20"/>
               </w:rPr>
-              <w:t xml:space="preserve">11/08/2026</w:t>
+              <w:t xml:space="preserve">14/08/2026</w:t>
             </w:r>
           </w:p>
         </w:tc>
@@ -574,14 +574,96 @@
           <w:sz w:val="21"/>
           <w:szCs w:val="21"/>
         </w:rPr>
-        <w:t xml:space="preserve">integrada de extremo a extremo</w:t>
-      </w:r>
-      <w:r>
-        <w:rPr>
-          <w:sz w:val="21"/>
-          <w:szCs w:val="21"/>
-        </w:rPr>
-        <w:t xml:space="preserve"> con los sistemas y las fuentes de datos del destino (sistemas municipales, redes sociales, analítica web y plataforma DTI). Todas las piezas del proyecto (plataforma, chatbot, observatorio de datos, panel de control, tótems y herramientas de mantenimiento) están </w:t>
+        <w:t xml:space="preserve">integrada y operativa en producción</w:t>
+      </w:r>
+      <w:r>
+        <w:rPr>
+          <w:sz w:val="21"/>
+          <w:szCs w:val="21"/>
+        </w:rPr>
+        <w:t xml:space="preserve">, con sus </w:t>
+      </w:r>
+      <w:r>
+        <w:rPr>
+          <w:b/>
+          <w:bCs/>
+          <w:sz w:val="21"/>
+          <w:szCs w:val="21"/>
+        </w:rPr>
+        <w:t xml:space="preserve">conectores a las fuentes externas</w:t>
+      </w:r>
+      <w:r>
+        <w:rPr>
+          <w:sz w:val="21"/>
+          <w:szCs w:val="21"/>
+        </w:rPr>
+        <w:t xml:space="preserve"> (redes sociales, analítica web y plataforma DTI) </w:t>
+      </w:r>
+      <w:r>
+        <w:rPr>
+          <w:b/>
+          <w:bCs/>
+          <w:color w:val="2E7D32"/>
+          <w:sz w:val="21"/>
+          <w:szCs w:val="21"/>
+        </w:rPr>
+        <w:t xml:space="preserve">construidos y verificados</w:t>
+      </w:r>
+      <w:r>
+        <w:rPr>
+          <w:sz w:val="21"/>
+          <w:szCs w:val="21"/>
+        </w:rPr>
+        <w:t xml:space="preserve">. El Ayuntamiento ya ha facilitado el </w:t>
+      </w:r>
+      <w:r>
+        <w:rPr>
+          <w:b/>
+          <w:bCs/>
+          <w:color w:val="2E7D32"/>
+          <w:sz w:val="21"/>
+          <w:szCs w:val="21"/>
+        </w:rPr>
+        <w:t xml:space="preserve">acceso a Facebook e Instagram</w:t>
+      </w:r>
+      <w:r>
+        <w:rPr>
+          <w:sz w:val="21"/>
+          <w:szCs w:val="21"/>
+        </w:rPr>
+        <w:t xml:space="preserve">, por lo que la </w:t>
+      </w:r>
+      <w:r>
+        <w:rPr>
+          <w:b/>
+          <w:bCs/>
+          <w:sz w:val="21"/>
+          <w:szCs w:val="21"/>
+        </w:rPr>
+        <w:t xml:space="preserve">activación con datos reales</w:t>
+      </w:r>
+      <w:r>
+        <w:rPr>
+          <w:sz w:val="21"/>
+          <w:szCs w:val="21"/>
+        </w:rPr>
+        <w:t xml:space="preserve"> del Social Listening y de Google Analytics se encuentra en su </w:t>
+      </w:r>
+      <w:r>
+        <w:rPr>
+          <w:b/>
+          <w:bCs/>
+          <w:sz w:val="21"/>
+          <w:szCs w:val="21"/>
+        </w:rPr>
+        <w:t xml:space="preserve">fase final de configuración</w:t>
+      </w:r>
+      <w:r>
+        <w:rPr>
+          <w:sz w:val="21"/>
+          <w:szCs w:val="21"/>
+        </w:rPr>
+        <w:t xml:space="preserve">. Todas las piezas del proyecto (plataforma, chatbot, observatorio de datos, panel de control, tótems y herramientas de mantenimiento) están </w:t>
       </w:r>
       <w:r>
         <w:rPr>
@@ -597,7 +679,23 @@
           <w:sz w:val="21"/>
           <w:szCs w:val="21"/>
         </w:rPr>
-        <w:t xml:space="preserve">. Los puntos pendientes se concentran ya casi exclusivamente en los </w:t>
+        <w:t xml:space="preserve">. Los puntos pendientes se concentran en la </w:t>
+      </w:r>
+      <w:r>
+        <w:rPr>
+          <w:b/>
+          <w:bCs/>
+          <w:sz w:val="21"/>
+          <w:szCs w:val="21"/>
+        </w:rPr>
+        <w:t xml:space="preserve">activación con datos reales de las fuentes externas</w:t>
+      </w:r>
+      <w:r>
+        <w:rPr>
+          <w:sz w:val="21"/>
+          <w:szCs w:val="21"/>
+        </w:rPr>
+        <w:t xml:space="preserve"> y en los </w:t>
       </w:r>
       <w:r>
         <w:rPr>
@@ -613,7 +711,7 @@
           <w:sz w:val="21"/>
           <w:szCs w:val="21"/>
         </w:rPr>
-        <w:t xml:space="preserve"> (auditoría de seguridad, formación y prueba de aceptación) y en la </w:t>
+        <w:t xml:space="preserve"> (auditoría de seguridad, formación y prueba de aceptación) hasta la </w:t>
       </w:r>
       <w:r>
         <w:rPr>
@@ -1654,7 +1752,7 @@
           <w:sz w:val="21"/>
           <w:szCs w:val="21"/>
         </w:rPr>
-        <w:t xml:space="preserve">pruebas funcionales y de accesibilidad (WCAG 2.1 AA), ajuste de los modelos de datos y de los cuadros de mando de Big Data, y </w:t>
+        <w:t xml:space="preserve">pruebas funcionales y de accesibilidad (WCAG 2.1 AA), ajuste de los modelos de datos y de los cuadros de mando de Big Data, e </w:t>
       </w:r>
       <w:r>
         <w:rPr>
@@ -1664,14 +1762,48 @@
           <w:sz w:val="21"/>
           <w:szCs w:val="21"/>
         </w:rPr>
-        <w:t xml:space="preserve">integración real y verificada con los sistemas municipales y las fuentes externas</w:t>
-      </w:r>
-      <w:r>
-        <w:rPr>
-          <w:sz w:val="21"/>
-          <w:szCs w:val="21"/>
-        </w:rPr>
-        <w:t xml:space="preserve"> (web/app y plataforma DTI existente, redes sociales —Facebook, Instagram, X—, Google Analytics del destino y sensórica de los tótems). El Social Listening y la analítica operan ya con datos reales.</w:t>
+        <w:t xml:space="preserve">integración con los sistemas municipales y la plataforma DTI existente</w:t>
+      </w:r>
+      <w:r>
+        <w:rPr>
+          <w:sz w:val="21"/>
+          <w:szCs w:val="21"/>
+        </w:rPr>
+        <w:t xml:space="preserve">. Los </w:t>
+      </w:r>
+      <w:r>
+        <w:rPr>
+          <w:b/>
+          <w:bCs/>
+          <w:color w:val="2E7D32"/>
+          <w:sz w:val="21"/>
+          <w:szCs w:val="21"/>
+        </w:rPr>
+        <w:t xml:space="preserve">conectores de Social Listening (Facebook, Instagram, X) y de Google Analytics 4 están construidos y verificados</w:t>
+      </w:r>
+      <w:r>
+        <w:rPr>
+          <w:sz w:val="21"/>
+          <w:szCs w:val="21"/>
+        </w:rPr>
+        <w:t xml:space="preserve">, con sus procedimientos de activación, verificación y renovación de credenciales ya preparados. El Ayuntamiento ha facilitado el </w:t>
+      </w:r>
+      <w:r>
+        <w:rPr>
+          <w:b/>
+          <w:bCs/>
+          <w:color w:val="2E7D32"/>
+          <w:sz w:val="21"/>
+          <w:szCs w:val="21"/>
+        </w:rPr>
+        <w:t xml:space="preserve">acceso a Facebook e Instagram</w:t>
+      </w:r>
+      <w:r>
+        <w:rPr>
+          <w:sz w:val="21"/>
+          <w:szCs w:val="21"/>
+        </w:rPr>
+        <w:t xml:space="preserve">.</w:t>
       </w:r>
     </w:p>
     <w:p>
@@ -1704,14 +1836,14 @@
           <w:sz w:val="21"/>
           <w:szCs w:val="21"/>
         </w:rPr>
-        <w:t xml:space="preserve">Auditoría de seguridad (pentest)</w:t>
-      </w:r>
-      <w:r>
-        <w:rPr>
-          <w:sz w:val="21"/>
-          <w:szCs w:val="21"/>
-        </w:rPr>
-        <w:t xml:space="preserve">: ejecución y entrega del informe.</w:t>
+        <w:t xml:space="preserve">Activación con datos reales de las fuentes externas</w:t>
+      </w:r>
+      <w:r>
+        <w:rPr>
+          <w:sz w:val="21"/>
+          <w:szCs w:val="21"/>
+        </w:rPr>
+        <w:t xml:space="preserve">: introducir las credenciales y ejecutar la verificación — redes sociales (acceso a Facebook/Instagram ya facilitado; pendiente el token de la app de Meta) y Google Analytics 4 (cuenta de servicio + Property ID del destino).</w:t>
       </w:r>
     </w:p>
     <w:p>
@@ -1730,14 +1862,14 @@
           <w:sz w:val="21"/>
           <w:szCs w:val="21"/>
         </w:rPr>
-        <w:t xml:space="preserve">Formación al personal (≥ 10 h)</w:t>
-      </w:r>
-      <w:r>
-        <w:rPr>
-          <w:sz w:val="21"/>
-          <w:szCs w:val="21"/>
-        </w:rPr>
-        <w:t xml:space="preserve"> y su acta.</w:t>
+        <w:t xml:space="preserve">Auditoría de seguridad (pentest)</w:t>
+      </w:r>
+      <w:r>
+        <w:rPr>
+          <w:sz w:val="21"/>
+          <w:szCs w:val="21"/>
+        </w:rPr>
+        <w:t xml:space="preserve">: ejecución y entrega del informe.</w:t>
       </w:r>
     </w:p>
     <w:p>
@@ -1751,87 +1883,19 @@
       </w:pPr>
       <w:r>
         <w:rPr>
-          <w:sz w:val="21"/>
-          <w:szCs w:val="21"/>
-        </w:rPr>
-        <w:t xml:space="preserve">Simulacro de copia de seguridad y restauración (acta de resultado).</w:t>
-      </w:r>
-    </w:p>
-    <w:p>
-      <w:pPr>
-        <w:pStyle w:val="Heading2"/>
-        <w:spacing w:after="90" w:before="220"/>
-      </w:pPr>
-      <w:r>
-        <w:rPr>
-          <w:b/>
-          <w:bCs/>
-          <w:color w:val="2E5496"/>
-          <w:sz w:val="26"/>
-          <w:szCs w:val="26"/>
-        </w:rPr>
-        <w:t xml:space="preserve">H4 — Puesta en producción y aceptación (SAT) · 85 %</w:t>
-      </w:r>
-    </w:p>
-    <w:p>
-      <w:pPr>
-        <w:spacing w:after="120" w:line="276"/>
-      </w:pPr>
-      <w:r>
-        <w:rPr>
-          <w:b/>
-          <w:bCs/>
-          <w:sz w:val="21"/>
-          <w:szCs w:val="21"/>
-        </w:rPr>
-        <w:t xml:space="preserve">Hecho: </w:t>
-      </w:r>
-      <w:r>
-        <w:rPr>
-          <w:b/>
-          <w:bCs/>
-          <w:sz w:val="21"/>
-          <w:szCs w:val="21"/>
-        </w:rPr>
-        <w:t xml:space="preserve">plataforma desplegada, integrada y operativa en el entorno de producción</w:t>
-      </w:r>
-      <w:r>
-        <w:rPr>
-          <w:sz w:val="21"/>
-          <w:szCs w:val="21"/>
-        </w:rPr>
-        <w:t xml:space="preserve"> (infraestructura cloud en la Unión Europea), </w:t>
-      </w:r>
-      <w:r>
-        <w:rPr>
-          <w:b/>
-          <w:bCs/>
-          <w:color w:val="2E7D32"/>
-          <w:sz w:val="21"/>
-          <w:szCs w:val="21"/>
-        </w:rPr>
-        <w:t xml:space="preserve">tótems en servicio</w:t>
-      </w:r>
-      <w:r>
-        <w:rPr>
-          <w:sz w:val="21"/>
-          <w:szCs w:val="21"/>
-        </w:rPr>
-        <w:t xml:space="preserve">, telemetría en funcionamiento, guion de la prueba de aceptación y documentación técnica.</w:t>
-      </w:r>
-    </w:p>
-    <w:p>
-      <w:pPr>
-        <w:spacing w:after="120" w:line="276"/>
-      </w:pPr>
-      <w:r>
-        <w:rPr>
-          <w:b/>
-          <w:bCs/>
-          <w:sz w:val="21"/>
-          <w:szCs w:val="21"/>
-        </w:rPr>
-        <w:t xml:space="preserve">Falta para cerrarlo:</w:t>
+          <w:b/>
+          <w:bCs/>
+          <w:sz w:val="21"/>
+          <w:szCs w:val="21"/>
+        </w:rPr>
+        <w:t xml:space="preserve">Formación al personal (≥ 10 h)</w:t>
+      </w:r>
+      <w:r>
+        <w:rPr>
+          <w:sz w:val="21"/>
+          <w:szCs w:val="21"/>
+        </w:rPr>
+        <w:t xml:space="preserve"> y su acta.</w:t>
       </w:r>
     </w:p>
     <w:p>
@@ -1845,35 +1909,87 @@
       </w:pPr>
       <w:r>
         <w:rPr>
-          <w:b/>
-          <w:bCs/>
-          <w:sz w:val="21"/>
-          <w:szCs w:val="21"/>
-        </w:rPr>
-        <w:t xml:space="preserve">Prueba de aceptación (SAT)</w:t>
-      </w:r>
-      <w:r>
-        <w:rPr>
-          <w:sz w:val="21"/>
-          <w:szCs w:val="21"/>
-        </w:rPr>
-        <w:t xml:space="preserve"> presencial y firma del </w:t>
-      </w:r>
-      <w:r>
-        <w:rPr>
-          <w:b/>
-          <w:bCs/>
-          <w:sz w:val="21"/>
-          <w:szCs w:val="21"/>
-        </w:rPr>
-        <w:t xml:space="preserve">acta de recepción</w:t>
-      </w:r>
-      <w:r>
-        <w:rPr>
-          <w:sz w:val="21"/>
-          <w:szCs w:val="21"/>
-        </w:rPr>
-        <w:t xml:space="preserve">.</w:t>
+          <w:sz w:val="21"/>
+          <w:szCs w:val="21"/>
+        </w:rPr>
+        <w:t xml:space="preserve">Simulacro de copia de seguridad y restauración (acta de resultado).</w:t>
+      </w:r>
+    </w:p>
+    <w:p>
+      <w:pPr>
+        <w:pStyle w:val="Heading2"/>
+        <w:spacing w:after="90" w:before="220"/>
+      </w:pPr>
+      <w:r>
+        <w:rPr>
+          <w:b/>
+          <w:bCs/>
+          <w:color w:val="2E5496"/>
+          <w:sz w:val="26"/>
+          <w:szCs w:val="26"/>
+        </w:rPr>
+        <w:t xml:space="preserve">H4 — Puesta en producción y aceptación (SAT) · 85 %</w:t>
+      </w:r>
+    </w:p>
+    <w:p>
+      <w:pPr>
+        <w:spacing w:after="120" w:line="276"/>
+      </w:pPr>
+      <w:r>
+        <w:rPr>
+          <w:b/>
+          <w:bCs/>
+          <w:sz w:val="21"/>
+          <w:szCs w:val="21"/>
+        </w:rPr>
+        <w:t xml:space="preserve">Hecho: </w:t>
+      </w:r>
+      <w:r>
+        <w:rPr>
+          <w:b/>
+          <w:bCs/>
+          <w:sz w:val="21"/>
+          <w:szCs w:val="21"/>
+        </w:rPr>
+        <w:t xml:space="preserve">plataforma desplegada, integrada y operativa en el entorno de producción</w:t>
+      </w:r>
+      <w:r>
+        <w:rPr>
+          <w:sz w:val="21"/>
+          <w:szCs w:val="21"/>
+        </w:rPr>
+        <w:t xml:space="preserve"> (infraestructura cloud en la Unión Europea), </w:t>
+      </w:r>
+      <w:r>
+        <w:rPr>
+          <w:b/>
+          <w:bCs/>
+          <w:color w:val="2E7D32"/>
+          <w:sz w:val="21"/>
+          <w:szCs w:val="21"/>
+        </w:rPr>
+        <w:t xml:space="preserve">tótems en servicio</w:t>
+      </w:r>
+      <w:r>
+        <w:rPr>
+          <w:sz w:val="21"/>
+          <w:szCs w:val="21"/>
+        </w:rPr>
+        <w:t xml:space="preserve">, telemetría en funcionamiento, guion de la prueba de aceptación y documentación técnica.</w:t>
+      </w:r>
+    </w:p>
+    <w:p>
+      <w:pPr>
+        <w:spacing w:after="120" w:line="276"/>
+      </w:pPr>
+      <w:r>
+        <w:rPr>
+          <w:b/>
+          <w:bCs/>
+          <w:sz w:val="21"/>
+          <w:szCs w:val="21"/>
+        </w:rPr>
+        <w:t xml:space="preserve">Falta para cerrarlo:</w:t>
       </w:r>
     </w:p>
     <w:p>
@@ -1887,6 +2003,48 @@
       </w:pPr>
       <w:r>
         <w:rPr>
+          <w:b/>
+          <w:bCs/>
+          <w:sz w:val="21"/>
+          <w:szCs w:val="21"/>
+        </w:rPr>
+        <w:t xml:space="preserve">Prueba de aceptación (SAT)</w:t>
+      </w:r>
+      <w:r>
+        <w:rPr>
+          <w:sz w:val="21"/>
+          <w:szCs w:val="21"/>
+        </w:rPr>
+        <w:t xml:space="preserve"> presencial y firma del </w:t>
+      </w:r>
+      <w:r>
+        <w:rPr>
+          <w:b/>
+          <w:bCs/>
+          <w:sz w:val="21"/>
+          <w:szCs w:val="21"/>
+        </w:rPr>
+        <w:t xml:space="preserve">acta de recepción</w:t>
+      </w:r>
+      <w:r>
+        <w:rPr>
+          <w:sz w:val="21"/>
+          <w:szCs w:val="21"/>
+        </w:rPr>
+        <w:t xml:space="preserve">.</w:t>
+      </w:r>
+    </w:p>
+    <w:p>
+      <w:pPr>
+        <w:pStyle w:val="ListParagraph"/>
+        <w:numPr>
+          <w:ilvl w:val="0"/>
+          <w:numId w:val="1"/>
+        </w:numPr>
+        <w:spacing w:after="60" w:line="264"/>
+      </w:pPr>
+      <w:r>
+        <w:rPr>
           <w:sz w:val="21"/>
           <w:szCs w:val="21"/>
         </w:rPr>
@@ -2009,7 +2167,7 @@
           <w:sz w:val="21"/>
           <w:szCs w:val="21"/>
         </w:rPr>
-        <w:t xml:space="preserve">Con los tótems instalados y las integraciones resueltas, la colaboración pendiente se limita a cerrar los actos formales de validación:</w:t>
+        <w:t xml:space="preserve">Con los tótems instalados y las integraciones construidas, la colaboración pendiente se limita a activar las fuentes externas y a cerrar los actos formales de validación:</w:t>
       </w:r>
     </w:p>
     <w:tbl>
@@ -2169,7 +2327,7 @@
                 <w:sz w:val="20"/>
                 <w:szCs w:val="20"/>
               </w:rPr>
-              <w:t xml:space="preserve">Autorización y ventana para la auditoría de seguridad (pentest) sobre los servicios en producción</w:t>
+              <w:t xml:space="preserve">Credenciales de las fuentes externas para la activación: token de la app de Meta (el acceso a Facebook/Instagram ya está facilitado) y cuenta de servicio + Property ID de Google Analytics 4</w:t>
             </w:r>
           </w:p>
         </w:tc>
@@ -2254,7 +2412,7 @@
                 <w:sz w:val="20"/>
                 <w:szCs w:val="20"/>
               </w:rPr>
-              <w:t xml:space="preserve">Designación de asistentes y fecha para la formación al personal (≥ 10 h)</w:t>
+              <w:t xml:space="preserve">Autorización y ventana para la auditoría de seguridad (pentest) sobre los servicios en producción</w:t>
             </w:r>
           </w:p>
         </w:tc>
@@ -2338,7 +2496,7 @@
                 <w:sz w:val="20"/>
                 <w:szCs w:val="20"/>
               </w:rPr>
-              <w:t xml:space="preserve">Fecha para la prueba de aceptación (SAT) presencial y firma del acta de recepción</w:t>
+              <w:t xml:space="preserve">Designación de asistentes y fecha para la formación al personal (≥ 10 h)</w:t>
             </w:r>
           </w:p>
         </w:tc>
@@ -2365,7 +2523,7 @@
                 <w:sz w:val="20"/>
                 <w:szCs w:val="20"/>
               </w:rPr>
-              <w:t xml:space="preserve">H4</w:t>
+              <w:t xml:space="preserve">H3</w:t>
             </w:r>
           </w:p>
         </w:tc>
@@ -2423,7 +2581,7 @@
                 <w:sz w:val="20"/>
                 <w:szCs w:val="20"/>
               </w:rPr>
-              <w:t xml:space="preserve">Confirmación de dominio(s) definitivo(s) del Ayuntamiento y, si procede, integración con el acceso interno municipal (SSO)</w:t>
+              <w:t xml:space="preserve">Fecha para la prueba de aceptación (SAT) presencial y firma del acta de recepción</w:t>
             </w:r>
           </w:p>
         </w:tc>
@@ -2507,6 +2665,91 @@
                 <w:sz w:val="20"/>
                 <w:szCs w:val="20"/>
               </w:rPr>
+              <w:t xml:space="preserve">Confirmación de dominio(s) definitivo(s) del Ayuntamiento y, si procede, integración con el acceso interno municipal (SSO)</w:t>
+            </w:r>
+          </w:p>
+        </w:tc>
+        <w:tc>
+          <w:tcPr>
+            <w:tcW w:type="dxa" w:w="1400"/>
+            <w:tcMar>
+              <w:top w:type="dxa" w:w="40"/>
+              <w:left w:type="dxa" w:w="90"/>
+              <w:bottom w:type="dxa" w:w="40"/>
+              <w:right w:type="dxa" w:w="90"/>
+            </w:tcMar>
+          </w:tcPr>
+          <w:p>
+            <w:pPr>
+              <w:spacing w:after="40" w:before="40"/>
+              <w:jc w:val="center"/>
+            </w:pPr>
+            <w:r>
+              <w:rPr>
+                <w:b w:val="false"/>
+                <w:bCs w:val="false"/>
+                <w:color w:val="000000"/>
+                <w:sz w:val="20"/>
+                <w:szCs w:val="20"/>
+              </w:rPr>
+              <w:t xml:space="preserve">H4</w:t>
+            </w:r>
+          </w:p>
+        </w:tc>
+      </w:tr>
+      <w:tr>
+        <w:tc>
+          <w:tcPr>
+            <w:tcW w:type="dxa" w:w="600"/>
+            <w:shd w:fill="EEF2F8" w:color="auto" w:val="clear"/>
+            <w:tcMar>
+              <w:top w:type="dxa" w:w="40"/>
+              <w:left w:type="dxa" w:w="90"/>
+              <w:bottom w:type="dxa" w:w="40"/>
+              <w:right w:type="dxa" w:w="90"/>
+            </w:tcMar>
+          </w:tcPr>
+          <w:p>
+            <w:pPr>
+              <w:spacing w:after="40" w:before="40"/>
+              <w:jc w:val="center"/>
+            </w:pPr>
+            <w:r>
+              <w:rPr>
+                <w:b w:val="false"/>
+                <w:bCs w:val="false"/>
+                <w:color w:val="000000"/>
+                <w:sz w:val="20"/>
+                <w:szCs w:val="20"/>
+              </w:rPr>
+              <w:t xml:space="preserve">6</w:t>
+            </w:r>
+          </w:p>
+        </w:tc>
+        <w:tc>
+          <w:tcPr>
+            <w:tcW w:type="dxa" w:w="7360"/>
+            <w:shd w:fill="EEF2F8" w:color="auto" w:val="clear"/>
+            <w:tcMar>
+              <w:top w:type="dxa" w:w="40"/>
+              <w:left w:type="dxa" w:w="90"/>
+              <w:bottom w:type="dxa" w:w="40"/>
+              <w:right w:type="dxa" w:w="90"/>
+            </w:tcMar>
+          </w:tcPr>
+          <w:p>
+            <w:pPr>
+              <w:spacing w:after="40" w:before="40"/>
+              <w:jc w:val="left"/>
+            </w:pPr>
+            <w:r>
+              <w:rPr>
+                <w:b w:val="false"/>
+                <w:bCs w:val="false"/>
+                <w:color w:val="000000"/>
+                <w:sz w:val="20"/>
+                <w:szCs w:val="20"/>
+              </w:rPr>
               <w:t xml:space="preserve">Contacto del Delegado de Protección de Datos y validación de los textos legales/privacidad publicados</w:t>
             </w:r>
           </w:p>
@@ -2514,6 +2757,7 @@
         <w:tc>
           <w:tcPr>
             <w:tcW w:type="dxa" w:w="1400"/>
+            <w:shd w:fill="EEF2F8" w:color="auto" w:val="clear"/>
             <w:tcMar>
               <w:top w:type="dxa" w:w="40"/>
               <w:left w:type="dxa" w:w="90"/>
@@ -2566,7 +2810,7 @@
           <w:sz w:val="21"/>
           <w:szCs w:val="21"/>
         </w:rPr>
-        <w:t xml:space="preserve">el alojamiento, el despliegue en producción, la instalación de los tótems y las integraciones ya están resueltos por IT DIGITTAL; no se requiere ninguna decisión de infraestructura ni de conectividad por parte del Ayuntamiento.</w:t>
+        <w:t xml:space="preserve">el alojamiento, el despliegue en producción, la instalación de los tótems y los conectores de integración ya están resueltos por IT DIGITTAL; la activación de las fuentes externas es un último paso de configuración (introducir credenciales y verificar), con procedimientos y herramientas ya preparados por nuestra parte.</w:t>
       </w:r>
     </w:p>
     <w:p>
@@ -2581,7 +2825,7 @@
           <w:sz w:val="21"/>
           <w:szCs w:val="21"/>
         </w:rPr>
-        <w:t xml:space="preserve">Por seguridad, cualquier credencial o token adicional no debe enviarse por correo en texto plano; facilitamos un canal seguro.</w:t>
+        <w:t xml:space="preserve">Por seguridad, cualquier credencial o token no debe enviarse por correo en texto plano; facilitamos un canal seguro.</w:t>
       </w:r>
     </w:p>
     <w:p>
@@ -2598,6 +2842,48 @@
           <w:szCs w:val="30"/>
         </w:rPr>
         <w:t xml:space="preserve">Próximos pasos propuestos</w:t>
+      </w:r>
+    </w:p>
+    <w:p>
+      <w:pPr>
+        <w:pStyle w:val="ListParagraph"/>
+        <w:numPr>
+          <w:ilvl w:val="0"/>
+          <w:numId w:val="2"/>
+        </w:numPr>
+        <w:spacing w:after="60"/>
+      </w:pPr>
+      <w:r>
+        <w:rPr>
+          <w:b/>
+          <w:bCs/>
+          <w:sz w:val="21"/>
+          <w:szCs w:val="21"/>
+        </w:rPr>
+        <w:t xml:space="preserve">Facilitar las credenciales</w:t>
+      </w:r>
+      <w:r>
+        <w:rPr>
+          <w:sz w:val="21"/>
+          <w:szCs w:val="21"/>
+        </w:rPr>
+        <w:t xml:space="preserve"> de Meta (token) y de Google Analytics 4 (cuenta de servicio + Property ID) para </w:t>
+      </w:r>
+      <w:r>
+        <w:rPr>
+          <w:b/>
+          <w:bCs/>
+          <w:sz w:val="21"/>
+          <w:szCs w:val="21"/>
+        </w:rPr>
+        <w:t xml:space="preserve">activar los datos reales</w:t>
+      </w:r>
+      <w:r>
+        <w:rPr>
+          <w:sz w:val="21"/>
+          <w:szCs w:val="21"/>
+        </w:rPr>
+        <w:t xml:space="preserve"> de redes sociales y analítica (cierre de la integración del H3).</w:t>
       </w:r>
     </w:p>
     <w:p>

</xml_diff>

<commit_message>
docs(hitos): refleja saneamiento y endurecimiento de CI/seguridad
Actualiza el informe de estado por hitos y el docx a 19/08/2026:
- Introducción: CI/CD en verde e imagen de producción endurecida (0 altas/críticas).
- H3 (Integración y pruebas): 90% -> 92%; añade el saneamiento del CI, el
  escaneo de imagen con gate estricto y la base de calidad que facilita el pentest.
- Resumen de avance: H3 92% y avance global ≈94%.

Co-Authored-By: Claude Opus 4.8 <noreply@anthropic.com>
Claude-Session: https://claude.ai/code/session_01FCMjLvkEuppXpAXUZM2gez
</commit_message>
<xml_diff>
--- a/InformeEstadoHitosAyuntamientoNijar.docx
+++ b/InformeEstadoHitosAyuntamientoNijar.docx
@@ -447,7 +447,7 @@
                 <w:sz w:val="20"/>
                 <w:szCs w:val="20"/>
               </w:rPr>
-              <w:t xml:space="preserve">14/08/2026</w:t>
+              <w:t xml:space="preserve">19/08/2026</w:t>
             </w:r>
           </w:p>
         </w:tc>
@@ -679,7 +679,58 @@
           <w:sz w:val="21"/>
           <w:szCs w:val="21"/>
         </w:rPr>
-        <w:t xml:space="preserve">. Los puntos pendientes se concentran en la </w:t>
+        <w:t xml:space="preserve">. Además, se ha </w:t>
+      </w:r>
+      <w:r>
+        <w:rPr>
+          <w:b/>
+          <w:bCs/>
+          <w:color w:val="2E7D32"/>
+          <w:sz w:val="21"/>
+          <w:szCs w:val="21"/>
+        </w:rPr>
+        <w:t xml:space="preserve">reforzado la calidad y la seguridad</w:t>
+      </w:r>
+      <w:r>
+        <w:rPr>
+          <w:sz w:val="21"/>
+          <w:szCs w:val="21"/>
+        </w:rPr>
+        <w:t xml:space="preserve"> del sistema: la </w:t>
+      </w:r>
+      <w:r>
+        <w:rPr>
+          <w:b/>
+          <w:bCs/>
+          <w:color w:val="2E7D32"/>
+          <w:sz w:val="21"/>
+          <w:szCs w:val="21"/>
+        </w:rPr>
+        <w:t xml:space="preserve">cadena de integración continua (CI/CD) está en verde</w:t>
+      </w:r>
+      <w:r>
+        <w:rPr>
+          <w:sz w:val="21"/>
+          <w:szCs w:val="21"/>
+        </w:rPr>
+        <w:t xml:space="preserve"> —pruebas automatizadas, análisis estático de seguridad (SAST), escaneo de dependencias y de la imagen de contenedor— y la </w:t>
+      </w:r>
+      <w:r>
+        <w:rPr>
+          <w:b/>
+          <w:bCs/>
+          <w:color w:val="2E7D32"/>
+          <w:sz w:val="21"/>
+          <w:szCs w:val="21"/>
+        </w:rPr>
+        <w:t xml:space="preserve">imagen de producción se ha endurecido hasta quedar sin vulnerabilidades altas ni críticas</w:t>
+      </w:r>
+      <w:r>
+        <w:rPr>
+          <w:sz w:val="21"/>
+          <w:szCs w:val="21"/>
+        </w:rPr>
+        <w:t xml:space="preserve">, lo que prepara y facilita la auditoría de seguridad (pentest) pendiente. Los puntos pendientes se concentran en la </w:t>
       </w:r>
       <w:r>
         <w:rPr>
@@ -1183,7 +1234,7 @@
                 <w:sz w:val="20"/>
                 <w:szCs w:val="20"/>
               </w:rPr>
-              <w:t xml:space="preserve">90 %</w:t>
+              <w:t xml:space="preserve">92 %</w:t>
             </w:r>
           </w:p>
         </w:tc>
@@ -1210,7 +1261,7 @@
                 <w:sz w:val="20"/>
                 <w:szCs w:val="20"/>
               </w:rPr>
-              <w:t xml:space="preserve">Integración finalizada; pendientes actos de validación</w:t>
+              <w:t xml:space="preserve">Integración finalizada y calidad/seguridad reforzadas; pendientes actos de validación</w:t>
             </w:r>
           </w:p>
         </w:tc>
@@ -1520,7 +1571,7 @@
                 <w:sz w:val="20"/>
                 <w:szCs w:val="20"/>
               </w:rPr>
-              <w:t xml:space="preserve">≈ 93 %</w:t>
+              <w:t xml:space="preserve">≈ 94 %</w:t>
             </w:r>
           </w:p>
         </w:tc>
@@ -1731,7 +1782,7 @@
           <w:sz w:val="26"/>
           <w:szCs w:val="26"/>
         </w:rPr>
-        <w:t xml:space="preserve">H3 — Integración y pruebas · 90 %</w:t>
+        <w:t xml:space="preserve">H3 — Integración y pruebas · 92 %</w:t>
       </w:r>
     </w:p>
     <w:p>
@@ -1803,7 +1854,41 @@
           <w:sz w:val="21"/>
           <w:szCs w:val="21"/>
         </w:rPr>
-        <w:t xml:space="preserve">.</w:t>
+        <w:t xml:space="preserve">. Se ha </w:t>
+      </w:r>
+      <w:r>
+        <w:rPr>
+          <w:b/>
+          <w:bCs/>
+          <w:color w:val="2E7D32"/>
+          <w:sz w:val="21"/>
+          <w:szCs w:val="21"/>
+        </w:rPr>
+        <w:t xml:space="preserve">saneado y endurecido la cadena de integración continua (CI/CD)</w:t>
+      </w:r>
+      <w:r>
+        <w:rPr>
+          <w:sz w:val="21"/>
+          <w:szCs w:val="21"/>
+        </w:rPr>
+        <w:t xml:space="preserve">, que queda en verde en todas sus comprobaciones (pruebas automatizadas —424—, formato y tipado, análisis estático de seguridad SAST, escaneo de dependencias y escaneo de la imagen de contenedor); la </w:t>
+      </w:r>
+      <w:r>
+        <w:rPr>
+          <w:b/>
+          <w:bCs/>
+          <w:color w:val="2E7D32"/>
+          <w:sz w:val="21"/>
+          <w:szCs w:val="21"/>
+        </w:rPr>
+        <w:t xml:space="preserve">imagen de producción se ha endurecido hasta 0 vulnerabilidades altas/críticas</w:t>
+      </w:r>
+      <w:r>
+        <w:rPr>
+          <w:sz w:val="21"/>
+          <w:szCs w:val="21"/>
+        </w:rPr>
+        <w:t xml:space="preserve"> y el control de seguridad de la imagen bloquea de forma estricta ante nuevas vulnerabilidades altas o críticas. Esta base de calidad reduce el riesgo y facilita la auditoría de seguridad (pentest).</w:t>
       </w:r>
     </w:p>
     <w:p>

</xml_diff>